<commit_message>
okay last one today, added links to usecase on readme
</commit_message>
<xml_diff>
--- a/523c0012_LAB6.docx
+++ b/523c0012_LAB6.docx
@@ -3834,10 +3834,15 @@
       </w:pPr>
       <w:r>
         <w:rPr>
-          <w:color w:val="000000"/>
-        </w:rPr>
+          <w:noProof/>
+        </w:rPr>
+      </w:r>
+      <w:r>
         <w:pict>
-          <v:rect id="_x0000_i1079" style="width:0;height:1.5pt" o:hralign="center" o:hrstd="t" o:hr="t" fillcolor="#a0a0a0" stroked="f"/>
+          <v:rect id="Horizontal Line 1" o:spid="_x0000_s2051" style="width:468pt;height:1.1pt;visibility:visible;mso-wrap-style:square;mso-left-percent:-10001;mso-top-percent:-10001;mso-position-horizontal:absolute;mso-position-horizontal-relative:char;mso-position-vertical:absolute;mso-position-vertical-relative:line;mso-left-percent:-10001;mso-top-percent:-10001;v-text-anchor:top" o:gfxdata="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" filled="f">
+            <o:lock v:ext="edit" rotation="t" aspectratio="t" verticies="t" text="t" shapetype="t"/>
+            <w10:anchorlock/>
+          </v:rect>
         </w:pict>
       </w:r>
     </w:p>
@@ -6455,11 +6460,15 @@
       </w:pPr>
       <w:r>
         <w:rPr>
-          <w:color w:val="000000"/>
-        </w:rPr>
-        <w:lastRenderedPageBreak/>
+          <w:noProof/>
+        </w:rPr>
+      </w:r>
+      <w:r>
         <w:pict>
-          <v:rect id="_x0000_i1085" style="width:0;height:1.5pt" o:hralign="center" o:hrstd="t" o:hr="t" fillcolor="#a0a0a0" stroked="f"/>
+          <v:rect id="Horizontal Line 2" o:spid="_x0000_s2050" style="width:468pt;height:1.1pt;visibility:visible;mso-wrap-style:square;mso-left-percent:-10001;mso-top-percent:-10001;mso-position-horizontal:absolute;mso-position-horizontal-relative:char;mso-position-vertical:absolute;mso-position-vertical-relative:line;mso-left-percent:-10001;mso-top-percent:-10001;v-text-anchor:top" o:gfxdata="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" filled="f">
+            <o:lock v:ext="edit" rotation="t" aspectratio="t" verticies="t" text="t" shapetype="t"/>
+            <w10:anchorlock/>
+          </v:rect>
         </w:pict>
       </w:r>
     </w:p>
@@ -9928,6 +9937,11 @@
       </w:r>
     </w:p>
     <w:p>
+      <w:pPr>
+        <w:rPr>
+          <w:lang w:val="vi-VN"/>
+        </w:rPr>
+      </w:pPr>
       <w:r>
         <w:rPr>
           <w:color w:val="000000"/>
@@ -10105,6 +10119,26 @@
             </a:graphic>
           </wp:inline>
         </w:drawing>
+      </w:r>
+    </w:p>
+    <w:p>
+      <w:pPr>
+        <w:rPr>
+          <w:lang w:val="vi-VN"/>
+        </w:rPr>
+      </w:pPr>
+    </w:p>
+    <w:p>
+      <w:pPr>
+        <w:rPr>
+          <w:lang w:val="vi-VN"/>
+        </w:rPr>
+      </w:pPr>
+      <w:r>
+        <w:rPr>
+          <w:lang w:val="vi-VN"/>
+        </w:rPr>
+        <w:t>I didn’t include the zip file in the labassignment, for it have exceed the 100mb limit, i will include it in my github page, thank you.</w:t>
       </w:r>
     </w:p>
     <w:sectPr>

</xml_diff>